<commit_message>
Revisão do parecer: versão final após segunda verificação (notas na ordem, normalização de PC e TN, contrafactual)
Renumera as notas na ordem das chamadas (o LibreOffice exibia textos trocados),
registra que PC e TN foram divididos pelo máximo na planilha, mede o PCM como
descrito no texto (rho 0,99; 153 de 157 seleções), explicita que os ajustes de
maio passaram à frente de suplentes com PCM maior, informa a versão de março e
o contrafactual com a etapa prévia fixa (152 municípios), marca os argumentos
técnicos dos pesos como verificação a posteriori e corrige a versão com marcas
(trechos duplicados). Atualiza planilha de dados, suplementares, carta e a
auditoria (variante da faixa P3 também na planilha de maio).

Co-Authored-By: Claude Opus 5.5 <noreply@anthropic.com>
Claude-Session: https://claude.ai/code/session_01MDzyNreLrve5brDgfNKZ3e
</commit_message>
<xml_diff>
--- a/creches-parana/10_revisao_parecer/Artigo_Creches_revisado_parecer.docx
+++ b/creches-parana/10_revisao_parecer/Artigo_Creches_revisado_parecer.docx
@@ -86,7 +86,7 @@
           <w:szCs w:val="21"/>
           <w:lang w:val="pt-BR"/>
         </w:rPr>
-        <w:t xml:space="preserve">Este artigo reconstrói, sistematiza e analisa a metodologia que converteu evidências municipais em uma regra efetiva de alocação de infraestrutura social: a distribuição de cerca de 300 creches financiadas pelo Governo do Paraná entre os 399 municípios do estado, no Programa Infância Feliz Paraná (Lei Estadual nº 21.870/2023). O Potencial de Creche por Município (PCM) combina nove indicadores oficiais em três pilares (educacional, demográfico e socioeconômico), normalizados pelo método mínimo-máximo e agregados com pesos 2, 1 e 2. Integrado a faixas de porte, cotas, tetos e arredondamento pelo maior resto, o índice foi aprovado pelo conselho estadual de direitos e publicado com a lista de municípios elegíveis, com impacto alocativo direto sobre a seleção territorial do investimento. A avaliação ex ante da regra, por reconstrução documental, auditoria das planilhas e análise de sensibilidade, mostra ordenamento estável a pesos e normalização (correlações de postos de 0,93 a 0,97) e uma regra que contemplou 258 municípios com 300 unidades, contra 147 sob critério populacional, mantendo 89% das crianças de zero a quatro anos em municípios contemplados. O desenho metodológico definiu a territorialização da política; seus efeitos sociais cabem a uma avaliação ex post.</w:t>
+        <w:t xml:space="preserve">Este artigo reconstrói, sistematiza e analisa a metodologia que converteu evidências municipais em uma regra efetiva de alocação de infraestrutura social: a distribuição de cerca de 300 creches financiadas pelo Governo do Paraná entre os 399 municípios do estado, no Programa Infância Feliz Paraná (Lei Estadual nº 21.870/2023). O Potencial de Creche por Município (PCM) combina nove indicadores oficiais em três pilares (educacional, demográfico e socioeconômico), normalizados pelo método mínimo-máximo e agregados com pesos 2, 1 e 2. Integrado a faixas de porte, cotas, tetos e arredondamento pelo maior resto, o índice foi aprovado pelo conselho estadual de direitos e publicado com a lista de municípios elegíveis, com impacto alocativo direto sobre a seleção territorial do investimento. A avaliação ex ante da regra, por reconstrução documental, auditoria das planilhas e análise de sensibilidade, mostra ordenamento estável a pesos e normalização (correlações de postos de 0,93 a 0,97) e uma versão aprovada que contemplou 258 municípios com 300 unidades, contra 147 sob critério populacional, mantendo 89% das crianças de zero a quatro anos em municípios contemplados. O desenho metodológico definiu a territorialização da política; seus efeitos sociais cabem a uma avaliação ex post.</w:t>
       </w:r>
     </w:p>
     <w:p>
@@ -148,7 +148,7 @@
           <w:sz w:val="24"/>
           <w:szCs w:val="21"/>
         </w:rPr>
-        <w:t>This article reconstructs, systematizes and analyzes the methodology that converted municipal evidence into an effective rule for allocating social infrastructure: the distribution of about 300 childcare centers funded by the State of Paraná among its 399 municipalities under the Infância Feliz Paraná Program (State Law 21,870/2023). The Childcare Potential by Municipality (PCM) combines nine official indicators in three pillars (educational, demographic and socioeconomic), normalized by the min-max method and aggregated with weights 2, 1 and 2. Integrated with size bands, quotas, caps and largest-remainder rounding, the index was approved by the state rights council and published with the list of eligible municipalities, with a direct allocative impact on the territorial selection of the investment. The ex ante evaluation of the rule, through documentary reconstruction, spreadsheet auditing and sensitivity analysis, shows a ranking that is stable to weights and normalization (rank correlations of 0.93 to 0.97) and a rule that reached 258 municipalities with 300 units, against 147 under a population criterion, while keeping 89% of children aged zero to four in covered municipalities. The methodological design defined the territorialization of the policy; its social effects belong to an ex post evaluation.</w:t>
+        <w:t>This article reconstructs, systematizes and analyzes the methodology that converted municipal evidence into an effective rule for allocating social infrastructure: the distribution of about 300 childcare centers funded by the State of Paraná among its 399 municipalities under the Infância Feliz Paraná Program (State Law 21,870/2023). The Childcare Potential by Municipality (PCM) combines nine official indicators in three pillars (educational, demographic and socioeconomic), normalized by the min-max method and aggregated with weights 2, 1 and 2. Integrated with size bands, quotas, caps and largest-remainder rounding, the index was approved by the state rights council and published with the list of eligible municipalities, with a direct allocative impact on the territorial selection of the investment. The ex ante evaluation of the rule, through documentary reconstruction, spreadsheet auditing and sensitivity analysis, shows a ranking that is stable to weights and normalization (rank correlations of 0.93 to 0.97) and an approved version that reached 258 municipalities with 300 units, against 147 under a population criterion, while keeping 89% of children aged zero to four in covered municipalities. The methodological design defined the territorialization of the policy; its social effects belong to an ex post evaluation.</w:t>
       </w:r>
     </w:p>
     <w:p>
@@ -208,7 +208,7 @@
         </w:rPr>
         <w:t xml:space="preserve">Este artículo reconstruye, sistematiza y analiza la metodología que convirtió evidencias municipales en una regla efectiva de asignación de infraestructura social: la distribución de cerca de 300 guarderías financiadas por el Gobierno de Paraná entre los 399 municipios del estado, en el Programa Infância Feliz Paraná (Ley Estadual 21.870/2023). El Potencial de </w:t>
         <w:lastRenderedPageBreak/>
-        <w:t xml:space="preserve">Guardería por Municipio (PCM) combina nueve indicadores oficiales en tres pilares (educativo, demográfico y socioeconómico), normalizados por el método mínimo-máximo y agregados con pesos 2, 1 y 2. Integrado a franjas de tamaño, cuotas, topes y redondeo por mayor resto, el índice fue aprobado por el consejo estadual de derechos y publicado con la lista de municipios elegibles, con impacto asignativo directo sobre la selección territorial de la inversión. La evaluación ex ante de la regla, por reconstrucción documental, auditoría de las planillas y análisis de sensibilidad, muestra un ordenamiento estable a pesos y normalización (correlaciones de rangos de 0,93 a 0,97) y una regla que alcanzó 258 municipios con 300 unidades, frente a 147 bajo un criterio poblacional, manteniendo al 89% de los niños de cero a cuatro años en municipios contemplados. El diseño metodológico definió la territorialización de la política; sus efectos sociales corresponden a una evaluación ex post.</w:t>
+        <w:t xml:space="preserve">Guardería por Municipio (PCM) combina nueve indicadores oficiales en tres pilares (educativo, demográfico y socioeconómico), normalizados por el método mínimo-máximo y agregados con pesos 2, 1 y 2. Integrado a franjas de tamaño, cuotas, topes y redondeo por mayor resto, el índice fue aprobado por el consejo estadual de derechos y publicado con la lista de municipios elegibles, con impacto asignativo directo sobre la selección territorial de la inversión. La evaluación ex ante de la regla, por reconstrucción documental, auditoría de las planillas y análisis de sensibilidad, muestra un ordenamiento estable a pesos y normalización (correlaciones de rangos de 0,93 a 0,97) y una versión aprobada que alcanzó 258 municipios con 300 unidades, frente a 147 bajo un criterio poblacional, manteniendo al 89% de los niños de cero a cuatro años en municipios contemplados. El diseño metodológico definió la territorialización de la política; sus efectos sociales corresponden a una evaluación ex post.</w:t>
       </w:r>
     </w:p>
     <w:p>
@@ -1691,7 +1691,7 @@
         <w:rPr>
           <w:lang w:val="pt-BR"/>
         </w:rPr>
-        <w:t xml:space="preserve">A dimensão fiscal municipal aparece em três obrigações: o custo que exceder o teto é do município; a obra deve ser concluída em 36 meses, sob pena de restituição; e o custeio posterior é municipal, financiado pelo Fundeb e por receitas próprias (PARANÁ, 2024c, art. 12, 13 e 18). Os recursos vieram da Secretaria da Fazenda Estadual, em complementação ao FIA, e da devolução de duodécimo pela Assembleia Legislativa. A Figura 2 resume o fluxo financeiro:</w:t>
+        <w:t xml:space="preserve">A dimensão fiscal municipal aparece em três obrigações: o custo que exceder o teto é do município; a obra deve ser concluída em 36 meses, sob pena de restituição; e o custeio posterior é municipal, financiado pelo Fundeb e por receitas próprias (PARANÁ, 2024c, art. 12, 13 e 18). Os recursos vieram do saldo do FIA/PR, da complementação da Secretaria da Fazenda Estadual e da devolução de duodécimo pela Assembleia Legislativa. A Figura 2 resume o fluxo financeiro:</w:t>
       </w:r>
     </w:p>
     <w:p>
@@ -4436,14 +4436,14 @@
         <w:rPr>
           <w:lang w:val="pt-BR"/>
         </w:rPr>
-        <w:t xml:space="preserve"> população de 5 a 14 anos dividida pela população total do Censo de 2022, como na planilha de cálculo</w:t>
+        <w:t xml:space="preserve"> prevista para a faixa de 0 a 4 anos, foi calculada na planilha com a de 5 a 14 anos do Censo de 2022</w:t>
       </w:r>
       <w:r>
         <w:rPr>
           <w:rStyle w:val="FootnoteReference"/>
           <w:lang w:val="pt-BR"/>
         </w:rPr>
-        <w:footnoteReference w:id="8"/>
+        <w:footnoteReference w:id="5"/>
       </w:r>
       <w:r>
         <w:rPr>
@@ -4488,7 +4488,7 @@
         <w:rPr>
           <w:lang w:val="pt-BR"/>
         </w:rPr>
-        <w:t xml:space="preserve">Logo, os três indicadores entram em sentido direto, normalizados pelo operador N, e o fator é sua média simples reescalonada:</w:t>
+        <w:t xml:space="preserve">Logo, os três indicadores entram em sentido direto, normalizados pelo operador N (na planilha, PC e TN foram apenas divididos pelo maior valor municipal), e o fator é sua média simples reescalonada:</w:t>
       </w:r>
     </w:p>
     <w:p>
@@ -7819,7 +7819,7 @@
         <w:rPr>
           <w:lang w:val="pt-BR"/>
         </w:rPr>
-        <w:t xml:space="preserve">Os pesos da Figura 3 decorreram de decisão discricionária da gestão pública, de natureza normativa: a equipe técnica da Casa Civil os fixou, e o CEDCA/PR os aprovou com o estudo e o ranqueamento (CEDCA, 2024). Não foram estimados a partir dos dados nem extraídos de um critério de focalização previamente validado; são pesos normativos na classificação de Decancq e Lugo (2013), e mesmo pesos estatísticos expressam juízos de valor (OECD; JRC, 2008, p. 31). O juízo segue o foco legal do programa nas crianças em situação de vulnerabilidade social (PARANÁ, 2023, 2024c) e a evidência da seção 2.2, segundo a qual a lacuna de vagas é o problema que a obra resolve e o retorno do acesso é maior entre as famílias pobres. Por isso, os fatores educacional e socioeconômico recebem peso 2, e o demográfico, peso 1.</w:t>
+        <w:t xml:space="preserve">Os pesos da Figura 3 decorreram de decisão discricionária da gestão pública: a equipe técnica da Casa Civil os fixou, e o CEDCA/PR os aprovou com o estudo e o ranqueamento (CEDCA, 2024). Não foram estimados a partir dos dados nem extraídos de um critério de focalização previamente validado; são pesos normativos na classificação de Decancq e Lugo (2013), e mesmo pesos estatísticos expressam juízos de valor (OECD; JRC, 2008, p. 31). O juízo segue o foco da lei do programa nas crianças em situação de vulnerabilidade social (PARANÁ, 2023) e a evidência da seção 2.2, segundo a qual a lacuna de vagas é o problema que a obra resolve e o retorno do acesso é maior entre as famílias pobres. Por isso, os fatores educacional e socioeconômico recebem peso 2, e o demográfico, peso 1.</w:t>
       </w:r>
     </w:p>
     <w:p>
@@ -7832,7 +7832,21 @@
         <w:rPr>
           <w:lang w:val="pt-BR"/>
         </w:rPr>
-        <w:t xml:space="preserve">Dois argumentos técnicos reforçam a escolha. Pesos estatísticos seriam pouco informativos, porque, com correlação fraca, é improvável que os indicadores compartilhem fatores comuns (OECD; JRC, 2008, p. 32, 89), e as correlações de postos entre os três fatores vão de 0,02 a 0,23. A qualidade dos dados, critério que o manual admite (OECD; JRC, 2008, p. 32), também pesa contra o fator demográfico, cuja mortalidade infantil é instável nos municípios pequenos: em 2020, 133 dos 399 municípios não registraram óbito infantil, e, com a mediana de 42 nascimentos por ano dos municípios de até 5 mil habitantes, um único óbito altera a taxa em cerca de 24 por mil. A equação (5) consolida o cálculo, e o Mapa 4 mostra o resultado:</w:t>
+        <w:t xml:space="preserve">Dois argumentos técnicos, verificados </w:t>
+      </w:r>
+      <w:r>
+        <w:rPr>
+          <w:i/>
+          <w:iCs/>
+          <w:lang w:val="pt-BR"/>
+        </w:rPr>
+        <w:t xml:space="preserve">a posteriori</w:t>
+      </w:r>
+      <w:r>
+        <w:rPr>
+          <w:lang w:val="pt-BR"/>
+        </w:rPr>
+        <w:t xml:space="preserve">, reforçam a escolha. Pesos de análise fatorial ou de componentes principais seriam pouco informativos, porque, com correlação fraca, é improvável que os fatores tenham uma dimensão latente comum (OECD; JRC, 2008, p. 32, 89); as correlações de postos entre eles vão de 0,02 a 0,23. A qualidade dos dados, critério que o manual admite com ressalvas (OECD; JRC, 2008, p. 32), também pesa contra o fator demográfico, cuja variação vem sobretudo da mortalidade infantil, instável nos municípios pequenos: em 2020, 133 dos 399 municípios não registraram óbito infantil, e, nos de até 5 mil habitantes, com mediana de 42 nascimentos por ano, um único óbito altera a taxa em cerca de 24 por mil. A equação (5) consolida o cálculo, e o Mapa 4 mostra o resultado:</w:t>
       </w:r>
     </w:p>
     <w:p>
@@ -8166,7 +8180,7 @@
         <w:rPr>
           <w:lang w:val="pt-BR"/>
         </w:rPr>
-        <w:t xml:space="preserve">Na normalização mínimo-máximo, um único município define o zero ou o cem de cada indicador, o que torna o índice sensível a valores extremos (OECD; JRC, 2008). Testamos pesos iguais, peso 3 no fator socioeconômico e 1 nos demais (variante que a planilha de março usou na faixa de 20 a 70 mil habitantes) e normalização por percentis. A correlação de postos com o PCM adotado fica entre 0,93 e 0,97, e de 138 a 144 dos 157 municípios que o PCM seleciona nas faixas de menor porte (seção 4.1) continuariam selecionados, com trocas a menos de sete centésimos das linhas de corte. A seção 4 converte esse ordenamento em unidades.</w:t>
+        <w:t xml:space="preserve">Na normalização mínimo-máximo, um único município define o zero ou o cem de cada indicador, o que torna o índice sensível a valores extremos (OECD; JRC, 2008). Testamos pesos iguais, peso 3 no fator socioeconômico e 1 nos demais (variante que as planilhas de março e maio usaram na faixa de 20 a 70 mil habitantes), normalização por percentis e a retirada da mortalidade infantil. A correlação de postos com o PCM adotado fica entre 0,93 e 0,97, e de 138 a 146 dos 157 municípios que o PCM seleciona nas faixas de menor porte (seção 4.1) continuariam selecionados, com trocas a menos de sete centésimos das linhas de corte. A seção 4 converte esse ordenamento em unidades.</w:t>
       </w:r>
     </w:p>
     <w:p>
@@ -8225,13 +8239,13 @@
           <w:rStyle w:val="FootnoteReference"/>
           <w:lang w:val="pt-BR"/>
         </w:rPr>
-        <w:footnoteReference w:id="5"/>
-      </w:r>
-      <w:r>
-        <w:rPr>
-          <w:lang w:val="pt-BR"/>
-        </w:rPr>
-        <w:t xml:space="preserve"> unidades em três momentos, conforme demonstrado nas subseções a seguir e sintetizado na figura 4. </w:t>
+        <w:footnoteReference w:id="6"/>
+      </w:r>
+      <w:r>
+        <w:rPr>
+          <w:lang w:val="pt-BR"/>
+        </w:rPr>
+        <w:t xml:space="preserve"> unidades em três blocos, descritos nas subseções a seguir e sintetizados na Figura 4.</w:t>
       </w:r>
     </w:p>
     <w:p>
@@ -9120,7 +9134,7 @@
         <w:rPr>
           <w:lang w:val="pt-BR"/>
         </w:rPr>
-        <w:t xml:space="preserve">Com isso, para os municípios de grande porte, o cálculo parte de uma cota por faixa de porte, proporcional à parcela da faixa na população-alvo do estado, que na planilha é a população de 5 a 14 anos (seção 3.2). O total a ser distribuído é reduzido pelo fator</w:t>
+        <w:t xml:space="preserve">Com isso, para os municípios de grande porte, o cálculo parte de uma cota por faixa de porte, proporcional à parcela da faixa na população-alvo do estado, que na planilha, pelo mesmo erro da seção 3.2, é a população de 5 a 14 anos. O total a ser distribuído é reduzido pelo fator</w:t>
       </w:r>
       <m:oMath>
         <m:r>
@@ -9135,7 +9149,7 @@
         <w:rPr>
           <w:lang w:val="pt-BR"/>
         </w:rPr>
-        <w:t xml:space="preserve">, em que m é o </w:t>
+        <w:t xml:space="preserve">, em que m deveria ser o </w:t>
       </w:r>
       <m:oMath>
         <m:r>
@@ -9428,7 +9442,7 @@
         <w:rPr>
           <w:lang w:val="pt-BR"/>
         </w:rPr>
-        <w:t xml:space="preserve"> = 257 é o número de unidades restantes após a etapa prévia. A cota da faixa é então repartida entre seus municípios na proporção da população-alvo, e o índice entra como multiplicador:</w:t>
+        <w:t xml:space="preserve"> = 257 é o número de unidades restantes após a etapa prévia. As planilhas de março e maio usam m = 0,503, valor digitado sem cálculo que o reproduza, também adotado na Figura 4 e na Tabela 6; uma versão anterior calculava 0,438. A cota da faixa é então repartida entre seus municípios na proporção da população-alvo, e o índice entra como multiplicador:</w:t>
       </w:r>
     </w:p>
     <w:p>
@@ -9835,7 +9849,7 @@
         <w:rPr>
           <w:lang w:val="pt-BR"/>
         </w:rPr>
-        <w:t>é a unidade eventualmente recebida na etapa prévia. O índice pondera a população: com PCM de 0,50, a população-alvo do município entra no cálculo multiplicada por 1,5. Curitiba ilustra o cálculo: a cota de sua faixa, que ocupa sozinha, é de 23,1 unidades; multiplicada por 1 + 0,286, seu PCM, chega a 29,7.</w:t>
+        <w:t>é a unidade eventualmente recebida na etapa prévia. O índice pondera a população-alvo, que, com PCM de 0,50, entra no cálculo multiplicada por 1,5. Curitiba ilustra o cálculo: a cota de sua faixa, que ocupa sozinha, é de 23,1 unidades; multiplicada por 1 + 0,286, seu PCM, chega a 29,7.</w:t>
       </w:r>
     </w:p>
     <w:p>
@@ -9935,7 +9949,7 @@
         <w:rPr>
           <w:lang w:val="pt-BR"/>
         </w:rPr>
-        <w:t xml:space="preserve">, com tetos de 10, 8, 7, 4 e 2 unidades por município, em ordem decrescente de porte, o que reduziu o total desses municípios de 142 para 100 e o de Curitiba, de 30 para 10. Como o total é fixo, o valor de m não altera o resultado: uma versão anterior da planilha calculava m = 0,438, o PCM médio ponderado pela população-alvo, e as de março e maio usam o valor fixo de 0,503.</w:t>
+        <w:t xml:space="preserve">, com tetos de 10, 8, 7, 4 e 2 unidades por município, em ordem decrescente de porte, o que reduziu o total desses municípios de 142 para 100 e o de Curitiba, de 30 para 10. Com o total fixo e os tetos, a alocação reproduzida é a mesma com os dois valores de m.</w:t>
       </w:r>
     </w:p>
     <w:p>
@@ -9983,7 +9997,7 @@
         <w:rPr>
           <w:lang w:val="pt-BR"/>
         </w:rPr>
-        <w:t xml:space="preserve">, excluídos os da etapa prévia, e os primeiros da fila recebem uma unidade: 27 dos 62 municípios de 20 a 70 mil habitantes, 100 dos 205 de 5 a 20 mil e 30 dos 102 com até 5 mil, o que soma 157 unidades. O </w:t>
+        <w:t xml:space="preserve"> (na faixa de 20 a 70 mil, pela variante com peso 3 no fator socioeconômico), excluídos os da etapa prévia, e os primeiros da fila recebem uma unidade: 27 dos 62 municípios de 20 a 70 mil habitantes, 100 dos 205 de 5 a 20 mil e 30 dos 102 com até 5 mil, o que soma 157 unidades. O </w:t>
       </w:r>
       <m:oMath>
         <m:r>
@@ -12625,7 +12639,7 @@
                 <w:color w:val="FFFFFF" w:themeColor="background1"/>
                 <w:szCs w:val="24"/>
               </w:rPr>
-              <w:t>Mun/</w:t>
+              <w:t>Mun.</w:t>
             </w:r>
           </w:p>
         </w:tc>
@@ -13529,7 +13543,7 @@
               <w:jc w:val="right"/>
             </w:pPr>
             <w:r>
-              <w:t>100 após tetos</w:t>
+              <w:t>100 (cota fixa)</w:t>
             </w:r>
           </w:p>
         </w:tc>
@@ -13563,14 +13577,14 @@
         <w:rPr>
           <w:lang w:val="pt-BR"/>
         </w:rPr>
-        <w:t xml:space="preserve">A Tabela 7 apresenta as versões sucessivas em todas as faixas. Ao reproduzir as regras, verificamos que, nas faixas de até 20 mil habitantes, os 130 contemplados do bloco 3 são exatamente os de maior PCM, com menos de um centésimo entre o último contemplado e o primeiro suplente; na faixa de 20 a 70 mil, a planilha de março usou a variante com peso 3 no fator socioeconômico (seção 3.4), e 26 dos 27 contemplados coincidem com os de maior PCM. Nos portes grandes, o maior resto com tetos reproduz 28 dos 30 valores. As versões seguintes se afastaram da ordem do índice: os 35 municípios que entraram em maio e dois dos três acrescentados pela resolução estavam abaixo das linhas de corte. Nenhum contemplado em março ficou fora da lista publicada</w:t>
+        <w:t xml:space="preserve">A Tabela 7 apresenta as versões sucessivas em todas as faixas. Ao reproduzir as regras, verificamos que, nas faixas de até 20 mil habitantes, os 130 contemplados do bloco 3 são exatamente os de maior PCM, com menos de um centésimo entre o último contemplado e o primeiro suplente; na faixa de 20 a 70 mil, as planilhas de março e maio usaram a variante com peso 3 no fator socioeconômico (seção 3.4), e 26 dos 27 contemplados coincidem com os de maior PCM. Nos portes grandes, o maior resto com tetos reproduz 28 dos 30 valores. As versões seguintes se afastaram da ordem do índice: os 35 municípios que entraram em maio e dois dos três acrescentados pela resolução passaram à frente de suplentes com PCM maior. Nenhum contemplado em março ficou fora da lista publicada</w:t>
       </w:r>
       <w:r>
         <w:rPr>
           <w:rStyle w:val="FootnoteReference"/>
           <w:lang w:val="pt-BR"/>
         </w:rPr>
-        <w:footnoteReference w:id="6"/>
+        <w:footnoteReference w:id="7"/>
       </w:r>
       <w:r>
         <w:rPr>
@@ -15442,20 +15456,20 @@
         <w:rPr>
           <w:lang w:val="pt-BR"/>
         </w:rPr>
-        <w:t xml:space="preserve">Para medir o efeito da regra adotada sobre a seleção territorial, comparamos a versão de maio de 2024, aprovada pelo CEDCA/PR, com um critério apenas populacional, que repartiria as mesmas 300 unidades em proporção à população de zero a quatro anos</w:t>
+        <w:t xml:space="preserve">Para medir o efeito da distribuição adotada sobre a seleção territorial, comparamos a versão de maio de 2024, aprovada pelo CEDCA/PR, com um critério apenas populacional, que repartiria as mesmas 300 unidades em proporção à população de zero a quatro anos</w:t>
       </w:r>
       <w:r>
         <w:rPr>
           <w:rStyle w:val="FootnoteReference"/>
           <w:lang w:val="pt-BR"/>
         </w:rPr>
-        <w:footnoteReference w:id="7"/>
-      </w:r>
-      <w:r>
-        <w:rPr>
-          <w:lang w:val="pt-BR"/>
-        </w:rPr>
-        <w:t xml:space="preserve">. A versão aprovada contemplou 258 municípios, contra 147, deu 6 unidades a Curitiba, contra 37, e destinou 28% das unidades aos 80 municípios de maior PCM, contra 13%; 89% das crianças de zero a quatro anos viviam em municípios contemplados, contra 85%.</w:t>
+        <w:footnoteReference w:id="8"/>
+      </w:r>
+      <w:r>
+        <w:rPr>
+          <w:lang w:val="pt-BR"/>
+        </w:rPr>
+        <w:t xml:space="preserve">. A versão aprovada contemplou 258 municípios, contra 147, deu 6 unidades a Curitiba, contra 37, e destinou 28% das unidades aos 80 municípios de maior PCM, contra 13%; 89% das crianças de zero a quatro anos viviam em municípios contemplados, contra 85%. Na versão de março, anterior à redistribuição, eram 224 municípios contemplados, com 82% das crianças.</w:t>
       </w:r>
     </w:p>
     <w:p>
@@ -15538,7 +15552,7 @@
         <w:rPr>
           <w:lang w:val="pt-BR"/>
         </w:rPr>
-        <w:t xml:space="preserve"> Os fatores reúnem registros da educação, da saúde, da assistência social e da economia regional e têm correlações de postos de 0,02 a 0,23 entre si (seção 3.4), de modo que cada um acrescenta informação própria. Como o fator educacional cresce com o porte e o socioeconômico diminui, o PCM médio fica entre 0,415 e 0,498 em todas as faixas, exceto em Curitiba (Tabela 5); um índice só educacional favoreceria as cidades maiores, e um só socioeconômico, as menores. A decisão percorreu o mesmo arco intersetorial, do estudo da Casa Civil e do Ipardes à adesão dos municípios (Figura 1).</w:t>
+        <w:t xml:space="preserve"> Os fatores reúnem registros da educação, da saúde, da assistência social e da economia regional e têm correlações de postos de 0,02 a 0,23 entre si (seção 3.4), de modo que cada um acrescenta informação própria. Como o fator educacional cresce com o porte e o socioeconômico diminui, o PCM médio fica entre 0,415 e 0,498 em todas as faixas, exceto em Curitiba (Tabela 5); um índice só educacional favoreceria as cidades maiores, e um só socioeconômico, as menores. A decisão também envolveu vários órgãos, do estudo da Casa Civil e do Ipardes à adesão dos municípios (Figura 1).</w:t>
       </w:r>
     </w:p>
     <w:p>
@@ -15558,13 +15572,13 @@
           <w:bCs/>
           <w:lang w:val="pt-BR"/>
         </w:rPr>
-        <w:t xml:space="preserve">A documentação da regra tornou a margem de decisão verificável.</w:t>
-      </w:r>
-      <w:r>
-        <w:rPr>
-          <w:lang w:val="pt-BR"/>
-        </w:rPr>
-        <w:t xml:space="preserve"> Confrontada com o estudo aprovado pelo CEDCA/PR e com a reconstrução das planilhas, a lista publicada (PARANÁ, 2024a) mostra onde a decisão seguiu o índice e onde se afastou dele. Nas faixas de até 20 mil habitantes, o bloco 3 segue a ordem do PCM, com menos de um centésimo entre o último contemplado e o primeiro suplente, dentro da imprecisão de qualquer indicador composto (OECD; JRC, 2008). Os municípios que entraram em maio, ao contrário, estavam abaixo das linhas de corte (seção 4.2). Terreno e capacidade de licitar, que o índice não capta, entram pela adesão (PARANÁ, 2024c), e a vaga de quem desiste passa ao próximo ranqueado (PARANÁ, 2024a).</w:t>
+        <w:t xml:space="preserve">A reconstrução da regra tornou verificável a margem de decisão.</w:t>
+      </w:r>
+      <w:r>
+        <w:rPr>
+          <w:lang w:val="pt-BR"/>
+        </w:rPr>
+        <w:t xml:space="preserve"> Confrontada com o estudo aprovado pelo CEDCA/PR e com as planilhas, a lista publicada (PARANÁ, 2024a) mostra onde a decisão seguiu o índice e onde se afastou dele. Nas faixas de até 20 mil habitantes, o bloco 3 segue a ordem do PCM, com menos de um centésimo entre o último contemplado e o primeiro suplente, dentro da margem em que pesos alternativos trocam municípios (seção 3.4). Os municípios que entraram em maio, ao contrário, passaram à frente de suplentes com PCM maior (seção 4.2). Terreno e capacidade de licitar, que o índice não capta, entram pela adesão (PARANÁ, 2024c), e a vaga de quem desiste passa ao próximo ranqueado (PARANÁ, 2024a).</w:t>
       </w:r>
     </w:p>
     <w:p>
@@ -15577,7 +15591,7 @@
         <w:rPr>
           <w:lang w:val="pt-BR"/>
         </w:rPr>
-        <w:t xml:space="preserve">A terceira lição remete à economia política do gasto público. Mogues (2015) parte da incongruência entre o retorno elevado de certos investimentos e sua negligência nas carteiras orçamentárias e atribui a alocação aos incentivos e às restrições de políticos, burocratas, grupos de interesse e doadores, às características dos bens e ao ambiente de governança. No Paraná, a decisão de investir em creches precedeu a regra, e o que ficou exposto a esses determinantes foi a escolha dos municípios. A regra explícita atua sobre o ambiente de governança porque torna os desvios identificáveis; com ela, o prefeito pode conferir por que seu município foi ou não contemplado e planejar o custeio com dados públicos.</w:t>
+        <w:t xml:space="preserve">A terceira lição remete à economia política do gasto público. Mogues (2015) parte da incongruência entre o retorno elevado de certos investimentos e sua negligência nas carteiras orçamentárias e atribui a alocação aos incentivos e às restrições de políticos, burocratas, grupos de interesse e doadores, às características dos bens e ao ambiente de governança. No Paraná, a decisão de investir em creches precedeu a regra, e o que ficou exposto a esses determinantes foi a escolha dos municípios. A regra explícita não impediu os ajustes posteriores; a reconstrução das planilhas os tornou identificáveis, e, publicados a ordem e os pesos, que a Resolução nº 219/2024 omite, cada prefeito poderia conferir sua posição e planejar o custeio.</w:t>
       </w:r>
     </w:p>
     <w:p>
@@ -15590,7 +15604,21 @@
         <w:rPr>
           <w:lang w:val="pt-BR"/>
         </w:rPr>
-        <w:t xml:space="preserve">Como todo indicador composto, o índice depende da qualidade e da data dos registros administrativos e é sensível a valores extremos na normalização; seus pesos são normativos, e suas proxies podem se afastar da necessidade vivida pelas famílias. A reconstrução revelou ainda um erro de referência na planilha, de efeito pequeno sobre a seleção (seção 3.2).</w:t>
+        <w:t xml:space="preserve">Como todo indicador composto, o índice depende da qualidade e da data dos registros administrativos e é sensível a valores extremos na normalização; seus pesos são normativos, e suas </w:t>
+      </w:r>
+      <w:r>
+        <w:rPr>
+          <w:i/>
+          <w:iCs/>
+          <w:lang w:val="pt-BR"/>
+        </w:rPr>
+        <w:t xml:space="preserve">proxies</w:t>
+      </w:r>
+      <w:r>
+        <w:rPr>
+          <w:lang w:val="pt-BR"/>
+        </w:rPr>
+        <w:t xml:space="preserve"> podem se afastar da necessidade vivida pelas famílias. A reconstrução revelou ainda erros na planilha, na faixa etária de PC e na normalização de dois indicadores, de efeito pequeno sobre a seleção (seção 3.2).</w:t>
       </w:r>
     </w:p>
     <w:p>
@@ -15603,7 +15631,21 @@
         <w:rPr>
           <w:lang w:val="pt-BR"/>
         </w:rPr>
-        <w:t xml:space="preserve">O resultado analisado aqui é a alocação. Uma avaliação ex post, com as unidades em funcionamento, poderá examinar a execução das obras, as matrículas e o emprego dos cuidadores, e verificar se o investimento produziu efeitos onde o índice apontou maior carência.</w:t>
+        <w:t xml:space="preserve">O resultado analisado aqui é a alocação. Uma avaliação </w:t>
+      </w:r>
+      <w:r>
+        <w:rPr>
+          <w:i/>
+          <w:iCs/>
+          <w:lang w:val="pt-BR"/>
+        </w:rPr>
+        <w:t xml:space="preserve">ex post</w:t>
+      </w:r>
+      <w:r>
+        <w:rPr>
+          <w:lang w:val="pt-BR"/>
+        </w:rPr>
+        <w:t xml:space="preserve">, com as unidades em funcionamento, poderá examinar a execução das obras, as matrículas e o emprego dos cuidadores, e verificar se o investimento produziu efeitos onde o índice apontou maior carência.</w:t>
       </w:r>
     </w:p>
     <w:p>
@@ -16678,13 +16720,7 @@
         <w:rPr>
           <w:lang w:val="pt-BR"/>
         </w:rPr>
-        <w:t xml:space="preserve"> </w:t>
-      </w:r>
-      <w:r>
-        <w:rPr>
-          <w:lang w:val="pt-BR"/>
-        </w:rPr>
-        <w:t>Com o andamento do programa, mais unidades foram incorporadas.</w:t>
+        <w:t xml:space="preserve"> A coluna da planilha rotulada como população de 0 a 4 anos, faixa que a Resolução SEDEF nº 219/2024 indica para PC (PARANÁ, 2024a, art. 3º), contém a de 5 a 14 anos (IBGE, 2023), usada também nas cotas dos portes grandes (seção 4.1). Calculado como descrito no texto, com a população de 0 a 4 anos e o operador N também em PC e TN, o PCM teria correlação de postos de 0,99 com o adotado; 153 dos 157 municípios que ele seleciona nas faixas de menor porte se manteriam, e duas unidades mudariam de município entre os 30 maiores.</w:t>
       </w:r>
     </w:p>
   </w:footnote>
@@ -16707,7 +16743,13 @@
         <w:rPr>
           <w:lang w:val="pt-BR"/>
         </w:rPr>
-        <w:t xml:space="preserve">A versão de maio reduziu os tetos dos portes grandes, o que liberou 37 unidades de 17 municípios, e retirou a unidade de Santa Terezinha de Itaipu (20 a 70 mil habitantes); as 38 unidades foram para 38 municípios, 37 deles das faixas inferiores, e a versão alcançou 300 unidades em 258 municípios, números anunciados em 10 de junho de 2024 (PARANÁ, 2024b). A Resolução SEDEF nº 219/2024 devolveu a unidade de Santa Terezinha de Itaipu, acrescentou uma a dois municípios de 5 a 20 mil habitantes e publicou 303 unidades em 261 municípios, com substituição do desistente pelo próximo ranqueado (PARANÁ, 2024a).</w:t>
+        <w:t xml:space="preserve"> </w:t>
+      </w:r>
+      <w:r>
+        <w:rPr>
+          <w:lang w:val="pt-BR"/>
+        </w:rPr>
+        <w:t>Com o andamento do programa, mais unidades foram incorporadas.</w:t>
       </w:r>
     </w:p>
   </w:footnote>
@@ -16730,7 +16772,7 @@
         <w:rPr>
           <w:lang w:val="pt-BR"/>
         </w:rPr>
-        <w:t xml:space="preserve">O critério populacional é uma simulação contrafactual da distribuição que se observaria na ausência da regra adotada: reparte as 300 unidades entre os 399 municípios em proporção à população de zero a quatro anos do Censo Demográfico de 2022 (IBGE, 2023), pelo maior resto usado no bloco 2 (BALINSKI; YOUNG, 2001), sem PCM, faixas, cotas, tetos ou etapa prévia. A versão de maio soma as mesmas 300 unidades e inclui as 43 da etapa prévia e as 38 redistribuídas após a redução dos tetos; na versão de março, eram 224 municípios contemplados, com 82% das crianças. A simulação é estática e não considera adesões, desistências nem capacidade de execução.</w:t>
+        <w:t xml:space="preserve"> A versão de maio reduziu os tetos dos portes grandes e retirou 37 unidades de 17 municípios dessas faixas, nem todas por efeito dos tetos, e a unidade de Santa Terezinha de Itaipu (20 a 70 mil habitantes); as 38 unidades foram para 38 municípios, 37 deles das faixas inferiores (35 sem unidade em março), e a versão alcançou 300 unidades em 258 municípios, números anunciados em 10 de junho de 2024 (PARANÁ, 2024b). A Resolução SEDEF nº 219/2024 devolveu a unidade de Santa Terezinha de Itaipu, acrescentou uma unidade a Corbélia e a Pranchita, de 5 a 20 mil habitantes, e publicou 303 unidades em 261 municípios, com substituição do desistente pelo próximo ranqueado (PARANÁ, 2024a).</w:t>
       </w:r>
     </w:p>
   </w:footnote>
@@ -16753,7 +16795,7 @@
         <w:rPr>
           <w:lang w:val="pt-BR"/>
         </w:rPr>
-        <w:t xml:space="preserve">A coluna da planilha rotulada como população de 0 a 4 anos contém a população de 5 a 14 anos do Censo de 2022 (IBGE, 2023), usada também nas cotas dos portes grandes (seção 4.1). Com a população de 0 a 4 anos, a correlação de postos com o PCM adotado seria 0,99, 154 dos 157 municípios selecionados nas faixas de menor porte se manteriam, e duas unidades mudariam de município entre os 30 maiores.</w:t>
+        <w:t xml:space="preserve"> O critério populacional é uma simulação contrafactual da distribuição que se observaria na ausência da regra adotada: reparte as 300 unidades entre os 399 municípios em proporção à população de zero a quatro anos do Censo Demográfico de 2022 (IBGE, 2023), pelo maior resto usado no bloco 2 (BALINSKI; YOUNG, 2001), sem PCM, faixas, cotas, tetos ou etapa prévia. A versão de maio soma as mesmas 300 unidades e inclui as 43 da etapa prévia, anteriores ao índice; mantidas essas 43 e repartidas as outras 257 pela população, seriam 152 municípios, 31 unidades em Curitiba e 17% das unidades nos 80 municípios de maior PCM. A simulação é estática e não considera adesões, desistências nem capacidade de execução.</w:t>
       </w:r>
     </w:p>
   </w:footnote>

</xml_diff>

<commit_message>
Revisão do parecer: auditoria final e pacote de submissão
Corrige pontos menores apontados na auditoria final (título em espanhol,
cronologia lei/decreto, frase sobre cobertura x Tabela 4, remissão a regiões,
coesão em 2.3, 1 e 4.1, ordem de duas referências) e monta o pacote
Submissao_RPD_revisao.zip com artigo, versão marcada, carta e suplementares.

Co-Authored-By: Claude Opus 5.5 <noreply@anthropic.com>
Claude-Session: https://claude.ai/code/session_01MDzyNreLrve5brDgfNKZ3e
</commit_message>
<xml_diff>
--- a/creches-parana/10_revisao_parecer/Artigo_Creches_revisado_parecer.docx
+++ b/creches-parana/10_revisao_parecer/Artigo_Creches_revisado_parecer.docx
@@ -46,7 +46,7 @@
           <w:b/>
           <w:lang w:val="pt-BR"/>
         </w:rPr>
-        <w:t xml:space="preserve">DE INDICADOR A REGLA DE ASIGNACIÓN: EL POTENCIAL DE GUARDERÍA POR MUNICIPIO EN EL “PROGRAMA INFÂNCIA FELIZ “</w:t>
+        <w:t xml:space="preserve">DE INDICADOR A REGLA DE ASIGNACIÓN: EL POTENCIAL DE GUARDERÍA POR MUNICIPIO EN EL “PROGRAMA INFÂNCIA FELIZ”</w:t>
       </w:r>
     </w:p>
     <w:p>
@@ -326,7 +326,7 @@
         <w:rPr>
           <w:lang w:val="pt-BR"/>
         </w:rPr>
-        <w:t xml:space="preserve">O objetivo é reconstruir essa metodologia e replicar como o indicador serviu de instrumento para essa política pública.  Com isso, a contribuição demonstra as consequências distributivas da regra sobre a seleção territorial das unidades</w:t>
+        <w:t xml:space="preserve">O objetivo é reconstruir essa metodologia, replicar seus cálculos e mostrar como o indicador serviu de instrumento para essa política pública. Com isso, a contribuição demonstra as consequências distributivas da regra sobre a seleção territorial das unidades</w:t>
       </w:r>
       <w:r>
         <w:rPr>
@@ -623,7 +623,7 @@
         <w:rPr>
           <w:lang w:val="pt-BR"/>
         </w:rPr>
-        <w:t xml:space="preserve">Em maio de 2024 aprovou o projeto padrão de 456,86 m² a R$ 1,30 milhão por unidade, o estudo e o ranqueamento dos municípios (CEDCA, 2024). A SEDEF regulamentou o incentivo (Resolução nº 212/2024) e publicou os critérios e a lista de elegíveis (Resolução nº 219/2024), que constituem a linha de base documental deste artigo (PARANÁ, 2024a, 2024c). Por fim, Paranacidade, serviço social autônomo da Secretaria das Cidades, elaborou o orçamento de referência e, desde 2025, analisa projetos, autoriza licitações e vistoria obras (PARANÁ, 2025). A Figura 1 sintetiza o processo decisório e os atores:</w:t>
+        <w:t xml:space="preserve">Em maio de 2024, o conselho aprovou o projeto padrão de 456,86 m² a R$ 1,30 milhão por unidade, o estudo e o ranqueamento dos municípios (CEDCA, 2024). A SEDEF regulamentou o incentivo (Resolução nº 212/2024) e publicou os critérios e a lista de elegíveis (Resolução nº 219/2024), que constituem a linha de base documental deste artigo (PARANÁ, 2024a, 2024c). Por fim, o Paranacidade, serviço social autônomo vinculado à Secretaria das Cidades, elaborou o orçamento de referência e, desde 2025, analisa projetos, autoriza licitações e vistoria obras (PARANÁ, 2025). A Figura 1 sintetiza o processo decisório e os atores:</w:t>
       </w:r>
     </w:p>
     <w:p>
@@ -1649,7 +1649,7 @@
         <w:rPr>
           <w:lang w:val="pt-BR"/>
         </w:rPr>
-        <w:t xml:space="preserve">O instrumento financeiro é o incentivo fundo a fundo, previsto na Lei Estadual nº 19.173/2017 e regulamentado pelo Decreto Estadual nº 10.455/2014, que disciplina a transferência automática do FIA/PR aos fundos municipais da criança e do adolescente. A Resolução SEDEF nº 212/2024 define o objeto:</w:t>
+        <w:t xml:space="preserve">O instrumento financeiro é o incentivo fundo a fundo, previsto na Lei Estadual nº 19.173/2017 e no Decreto Estadual nº 10.455/2014, que disciplina a transferência automática do FIA/PR aos fundos municipais da criança e do adolescente. A Resolução SEDEF nº 212/2024 define o objeto:</w:t>
       </w:r>
     </w:p>
     <w:p>
@@ -6914,7 +6914,7 @@
         <w:rPr>
           <w:lang w:val="pt-BR"/>
         </w:rPr>
-        <w:t>Curitiba tem fator zero, a referência mínima; o máximo é Cruzmaltina; a mediana é 42,1. O fator cai com o tamanho do município e concentra os maiores valores no Centro-Sul, no Vale do Ribeira e no litoral norte (Mapa 3), regiões que a seção 4 mostrará entre as mais contempladas.</w:t>
+        <w:t>Curitiba tem fator zero, a referência mínima; o máximo é Cruzmaltina; a mediana é 42,1. O fator cai com o tamanho do município e concentra os maiores valores no Centro-Sul, no Vale do Ribeira e no litoral norte (Mapa 3).</w:t>
       </w:r>
     </w:p>
     <w:p>
@@ -9106,7 +9106,7 @@
         <w:rPr>
           <w:lang w:val="pt-BR"/>
         </w:rPr>
-        <w:t xml:space="preserve">Os blocos 2 e 3 utilizados pelo PCM respondem à seguinte questão: em uma cidade grande, uma unidade atende a uma fração pequena das crianças, e faz sentido distribuir várias unidades na proporção da população; em um município pequeno, uma unidade já altera a cobertura, e a decisão relevante é quem entra na lista. </w:t>
+        <w:t xml:space="preserve">Os blocos 2 e 3 aplicam o PCM de formas distintas por uma razão de escala: em uma cidade grande, uma unidade atende a uma fração pequena das crianças, e faz sentido distribuir várias unidades na proporção da população; em um município pequeno, uma unidade já altera a cobertura, e a decisão relevante é quem entra na lista. </w:t>
       </w:r>
     </w:p>
     <w:p>
@@ -10058,7 +10058,7 @@
         <w:rPr>
           <w:lang w:val="pt-BR"/>
         </w:rPr>
-        <w:t xml:space="preserve">Os resultados seguem a ordem do mecanismo: primeiro, o que o índice diz sobre os portes; depois, o que a regra fez com ele. A Tabela 4 apresenta o retrato municipal por porte: a população infantil concentra-se nos extremos, com 58% das crianças nos 30 municípios das cinco faixas superiores e 23% nos 307 municípios com até 20 mil habitantes, e a cobertura de creche cresce à medida que o porte diminui, de 20,9% em Curitiba a 41,8% nos municípios com até cinco mil habitantes.</w:t>
+        <w:t xml:space="preserve">Os resultados seguem a ordem do mecanismo: primeiro, o que o índice diz sobre os portes; depois, o que a regra fez com ele. A Tabela 4 apresenta o retrato municipal por porte: a população infantil concentra-se nos extremos, com 58% das crianças nos 30 municípios das cinco faixas superiores e 23% nos 307 municípios com até 20 mil habitantes, e a cobertura de creche é menor nos portes acima de 100 mil habitantes, de 7,6% a 25,5%, e chega a 41,8% nos municípios com até cinco mil habitantes.</w:t>
       </w:r>
     </w:p>
     <w:p>
@@ -15739,6 +15739,7 @@
         <w:rPr>
           <w:sz w:val="21"/>
           <w:szCs w:val="21"/>
+          <w:lang w:val="pt-BR"/>
         </w:rPr>
       </w:pPr>
       <w:r>
@@ -15746,7 +15747,15 @@
           <w:sz w:val="21"/>
           <w:szCs w:val="21"/>
         </w:rPr>
-        <w:t>BARROS, R. P. de; OLINTO, P.; LUNDE, T.; CARVALHO, M. The impact of access to free childcare on women's labor market outcomes: evidence from a randomized trial in low-income neighborhoods of Rio de Janeiro. Washington, DC: The World Bank, 2011.</w:t>
+        <w:t xml:space="preserve">BALINSKI, M. L.; YOUNG, H. P. Fair representation: meeting the ideal of one man, one vote. </w:t>
+      </w:r>
+      <w:r>
+        <w:rPr>
+          <w:sz w:val="21"/>
+          <w:szCs w:val="21"/>
+          <w:lang w:val="pt-BR"/>
+        </w:rPr>
+        <w:t xml:space="preserve">2. ed. Washington, DC: Brookings Institution Press, 2001.</w:t>
       </w:r>
     </w:p>
     <w:p>
@@ -15756,7 +15765,6 @@
         <w:rPr>
           <w:sz w:val="21"/>
           <w:szCs w:val="21"/>
-          <w:lang w:val="pt-BR"/>
         </w:rPr>
       </w:pPr>
       <w:r>
@@ -15764,15 +15772,26 @@
           <w:sz w:val="21"/>
           <w:szCs w:val="21"/>
         </w:rPr>
-        <w:t xml:space="preserve">BALINSKI, M. L.; YOUNG, H. P. Fair representation: meeting the ideal of one man, one vote. </w:t>
-      </w:r>
-      <w:r>
+        <w:t>BARROS, R. P. de; OLINTO, P.; LUNDE, T.; CARVALHO, M. The impact of access to free childcare on women's labor market outcomes: evidence from a randomized trial in low-income neighborhoods of Rio de Janeiro. Washington, DC: The World Bank, 2011.</w:t>
+      </w:r>
+    </w:p>
+    <w:p>
+      <w:pPr>
+        <w:spacing w:after="80" w:line="240" w:lineRule="auto"/>
+        <w:ind w:firstLine="0"/>
         <w:rPr>
           <w:sz w:val="21"/>
           <w:szCs w:val="21"/>
           <w:lang w:val="pt-BR"/>
         </w:rPr>
-        <w:t xml:space="preserve">2. ed. Washington, DC: Brookings Institution Press, 2001.</w:t>
+      </w:pPr>
+      <w:r>
+        <w:rPr>
+          <w:sz w:val="21"/>
+          <w:szCs w:val="21"/>
+          <w:lang w:val="pt-BR"/>
+        </w:rPr>
+        <w:t>BRASIL. Constituição da República Federativa do Brasil de 1988. Brasília, DF: Presidência da República, 1988.</w:t>
       </w:r>
     </w:p>
     <w:p>
@@ -15791,7 +15810,7 @@
           <w:szCs w:val="21"/>
           <w:lang w:val="pt-BR"/>
         </w:rPr>
-        <w:t>BRASIL. Constituição da República Federativa do Brasil de 1988. Brasília, DF: Presidência da República, 1988.</w:t>
+        <w:t>BRASIL. Lei nº 9.394, de 20 de dezembro de 1996. Estabelece as diretrizes e bases da educação nacional. Diário Oficial da União, Brasília, DF, 23 dez. 1996.</w:t>
       </w:r>
     </w:p>
     <w:p>
@@ -15810,7 +15829,7 @@
           <w:szCs w:val="21"/>
           <w:lang w:val="pt-BR"/>
         </w:rPr>
-        <w:t>BRASIL. Lei nº 9.394, de 20 de dezembro de 1996. Estabelece as diretrizes e bases da educação nacional. Diário Oficial da União, Brasília, DF, 23 dez. 1996.</w:t>
+        <w:t>BRASIL. Lei nº 13.005, de 25 de junho de 2014. Aprova o Plano Nacional de Educação (PNE) e dá outras providências. Diário Oficial da União, Brasília, DF, 26 jun. 2014.</w:t>
       </w:r>
     </w:p>
     <w:p>
@@ -15829,7 +15848,7 @@
           <w:szCs w:val="21"/>
           <w:lang w:val="pt-BR"/>
         </w:rPr>
-        <w:t>BRASIL. Lei nº 13.005, de 25 de junho de 2014. Aprova o Plano Nacional de Educação (PNE) e dá outras providências. Diário Oficial da União, Brasília, DF, 26 jun. 2014.</w:t>
+        <w:t>BRASIL. Lei nº 14.113, de 25 de dezembro de 2020. Regulamenta o Fundo de Manutenção e Desenvolvimento da Educação Básica e de Valorização dos Profissionais da Educação (Fundeb). Diário Oficial da União, Brasília, DF, 25 dez. 2020.</w:t>
       </w:r>
     </w:p>
     <w:p>
@@ -15848,7 +15867,7 @@
           <w:szCs w:val="21"/>
           <w:lang w:val="pt-BR"/>
         </w:rPr>
-        <w:t>BRASIL. Lei nº 14.113, de 25 de dezembro de 2020. Regulamenta o Fundo de Manutenção e Desenvolvimento da Educação Básica e de Valorização dos Profissionais da Educação (Fundeb). Diário Oficial da União, Brasília, DF, 25 dez. 2020.</w:t>
+        <w:t>BRASIL. Supremo Tribunal Federal. Recurso Extraordinário nº 1.008.166 (Tema 548 da repercussão geral). Plenário, 22 set. 2022.</w:t>
       </w:r>
     </w:p>
     <w:p>
@@ -15867,7 +15886,8 @@
           <w:szCs w:val="21"/>
           <w:lang w:val="pt-BR"/>
         </w:rPr>
-        <w:t>BRASIL. Supremo Tribunal Federal. Recurso Extraordinário nº 1.008.166 (Tema 548 da repercussão geral). Plenário, 22 set. 2022.</w:t>
+        <w:lastRenderedPageBreak/>
+        <w:t>BRASIL. Ministério da Saúde. Sistema de Vigilância Alimentar e Nutricional (Sisvan) e acompanhamento das condicionalidades de saúde do Programa Bolsa Família: relatórios públicos de 2023. Brasília, DF: Ministério da Saúde, 2024. Disponível em: https://sisaps.saude.gov.br/sisvan/relatoriopublico/index. Acesso em: 28 set. 2026.</w:t>
       </w:r>
     </w:p>
     <w:p>
@@ -15887,26 +15907,6 @@
           <w:lang w:val="pt-BR"/>
         </w:rPr>
         <w:t>BRASIL. Ministério da Educação; GAEPE-BRASIL; INSTITUTO ARTICULE. Retrato da educação infantil no Brasil 2025. Brasília, DF: MEC, 2025.</w:t>
-      </w:r>
-    </w:p>
-    <w:p>
-      <w:pPr>
-        <w:spacing w:after="80" w:line="240" w:lineRule="auto"/>
-        <w:ind w:firstLine="0"/>
-        <w:rPr>
-          <w:sz w:val="21"/>
-          <w:szCs w:val="21"/>
-          <w:lang w:val="pt-BR"/>
-        </w:rPr>
-      </w:pPr>
-      <w:r>
-        <w:rPr>
-          <w:sz w:val="21"/>
-          <w:szCs w:val="21"/>
-          <w:lang w:val="pt-BR"/>
-        </w:rPr>
-        <w:lastRenderedPageBreak/>
-        <w:t>BRASIL. Ministério da Saúde. Sistema de Vigilância Alimentar e Nutricional (Sisvan) e acompanhamento das condicionalidades de saúde do Programa Bolsa Família: relatórios públicos de 2023. Brasília, DF: Ministério da Saúde, 2024. Disponível em: https://sisaps.saude.gov.br/sisvan/relatoriopublico/index. Acesso em: 28 set. 2026.</w:t>
       </w:r>
     </w:p>
     <w:p>

</xml_diff>

<commit_message>
Revisão do parecer: pesos fundamentados no critério de focalização social
Seção 3.4 e carta (ponto 2): os pesos passam a ser apresentados como
tradução do critério de focalização da Deliberação CEDCA 60/2023, da
Lei 21.870/2023 e da estratégia 1.2 do PNE, com a explicação do peso 1
do fator demográfico e a aprovação do ranqueamento pelo CEDCA/PR
(Deliberação 25/2024). Lição 1 e carta (ponto 1) passam a citar o
contrafactual populacional da seção 4.2. Manuscrito mantém 22 páginas.

Co-Authored-By: Claude Opus 5.5 <noreply@anthropic.com>
Claude-Session: https://claude.ai/code/session_01MDzyNreLrve5brDgfNKZ3e
</commit_message>
<xml_diff>
--- a/creches-parana/10_revisao_parecer/Artigo_Creches_revisado_parecer.docx
+++ b/creches-parana/10_revisao_parecer/Artigo_Creches_revisado_parecer.docx
@@ -7819,7 +7819,7 @@
         <w:rPr>
           <w:lang w:val="pt-BR"/>
         </w:rPr>
-        <w:t xml:space="preserve">Os pesos da Figura 3 decorreram de decisão discricionária da gestão pública: a equipe técnica da Casa Civil os fixou, e o CEDCA/PR os aprovou com o estudo e o ranqueamento (CEDCA, 2024). Não foram estimados a partir dos dados nem extraídos de um critério de focalização previamente validado; são pesos normativos na classificação de Decancq e Lugo (2013), e mesmo pesos estatísticos expressam juízos de valor (OECD; JRC, 2008, p. 31). O juízo segue o foco da lei do programa nas crianças em situação de vulnerabilidade social (PARANÁ, 2023) e a evidência da seção 2.2, segundo a qual a lacuna de vagas é o problema que a obra resolve e o retorno do acesso é maior entre as famílias pobres. Por isso, os fatores educacional e socioeconômico recebem peso 2, e o demográfico, peso 1.</w:t>
+        <w:t xml:space="preserve">Os pesos da Figura 3 traduzem um critério de focalização social. A Deliberação nº 60/2023 do CEDCA/PR incumbiu a SEDEF de definir e ordenar por prioridade as localidades de maior vulnerabilidade, risco social e elevada demanda para a educação infantil (CEDCA, 2023, art. 2º). A lei do programa destina as creches às crianças em situação de vulnerabilidade (PARANÁ, 2023), e o Plano Nacional de Educação fixou como estratégia reduzir a menos de 10% a diferença de frequência à creche entre o quinto de renda mais alto e o mais baixo (BRASIL, 2014, estratégia 1.2). A demanda priorizada aparece sobretudo na lacuna de vagas, que o fator educacional mede, e o retorno do acesso à creche é maior entre as famílias pobres (seção 2.2). Por isso, os fatores educacional e socioeconômico recebem peso 2, e o demográfico, que capta a pressão potencial da demanda por indicadores indiretos, peso 1. A equipe técnica da Casa Civil converteu a orientação nesses valores, aplicados no ranqueamento que o CEDCA/PR aprovou com o estudo; a Deliberação nº 25/2024 registra que o estudo considerou os dados de vulnerabilidade, risco social e demanda (CEDCA, 2024). Na classificação de Decancq e Lugo (2013), a ponderação é normativa, sem estimação estatística, e o manual da OCDE admite pesos que reflitam prioridades de política (OECD; JRC, 2008, p. 31).</w:t>
       </w:r>
     </w:p>
     <w:p>
@@ -7846,7 +7846,7 @@
         <w:rPr>
           <w:lang w:val="pt-BR"/>
         </w:rPr>
-        <w:t xml:space="preserve">, reforçam a escolha. Pesos de análise fatorial ou de componentes principais seriam pouco informativos, porque, com correlação fraca, é improvável que os fatores tenham uma dimensão latente comum (OECD; JRC, 2008, p. 32, 89); as correlações de postos entre eles vão de 0,02 a 0,23. A qualidade dos dados, critério que o manual admite com ressalvas (OECD; JRC, 2008, p. 32), também pesa contra o fator demográfico, cuja variação vem sobretudo da mortalidade infantil, instável nos municípios pequenos: em 2020, 133 dos 399 municípios não registraram óbito infantil, e, nos de até 5 mil habitantes, com mediana de 42 nascimentos por ano, um único óbito altera a taxa em cerca de 24 por mil. A equação (5) consolida o cálculo, e o Mapa 4 mostra o resultado:</w:t>
+        <w:t xml:space="preserve">, reforçam a escolha. Com correlações de postos de 0,02 a 0,23 entre os fatores, é improvável uma dimensão latente comum, e pesos de análise fatorial ou de componentes principais seriam pouco informativos (OECD; JRC, 2008, p. 32, 89). A qualidade dos dados, critério que o manual admite com ressalvas (OECD; JRC, 2008, p. 32), corrobora o peso menor do fator demográfico, cuja variação vem sobretudo da mortalidade infantil, instável nos municípios pequenos. Em 2020, 133 dos 399 municípios não registraram óbito infantil, e, nos de até 5 mil habitantes, com mediana de 42 nascimentos por ano, um único óbito altera a taxa em cerca de 24 por mil. A equação (5) consolida o cálculo, e o Mapa 4 mostra o resultado:</w:t>
       </w:r>
     </w:p>
     <w:p>
@@ -8180,7 +8180,7 @@
         <w:rPr>
           <w:lang w:val="pt-BR"/>
         </w:rPr>
-        <w:t xml:space="preserve">Na normalização mínimo-máximo, um único município define o zero ou o cem de cada indicador, o que torna o índice sensível a valores extremos (OECD; JRC, 2008). Testamos pesos iguais, peso 3 no fator socioeconômico e 1 nos demais (variante que as planilhas de março e maio usaram na faixa de 20 a 70 mil habitantes), normalização por percentis e a retirada da mortalidade infantil. A correlação de postos com o PCM adotado fica entre 0,93 e 0,97, e de 138 a 146 dos 157 municípios que o PCM seleciona nas faixas de menor porte (seção 4.1) continuariam selecionados, com trocas a menos de sete centésimos das linhas de corte. A seção 4 converte esse ordenamento em unidades.</w:t>
+        <w:t xml:space="preserve">Na normalização mínimo-máximo, um único município define o zero ou o cem de cada indicador, o que torna o índice sensível a valores extremos (OECD; JRC, 2008). Testamos pesos iguais, peso 3 no fator socioeconômico e 1 nos demais (variante ainda mais focalizada na vulnerabilidade, que as planilhas de março e maio usaram na faixa de 20 a 70 mil habitantes), normalização por percentis e retirada da mortalidade infantil. A correlação de postos com o PCM adotado fica entre 0,93 e 0,97, e de 138 a 146 dos 157 municípios que o PCM seleciona nas faixas de menor porte (seção 4.1) se manteriam, com trocas a menos de sete centésimos das linhas de corte. A seção 4 converte esse ordenamento em unidades.</w:t>
       </w:r>
     </w:p>
     <w:p>
@@ -15526,7 +15526,7 @@
         <w:rPr>
           <w:lang w:val="pt-BR"/>
         </w:rPr>
-        <w:t xml:space="preserve"> Com PCM igual à média estadual, 0,48 (Tabela 5), um município de 5 a 20 mil habitantes seria contemplado no bloco 3, cuja linha de corte nessa faixa ficou em 0,469. Um de até 5 mil seria suplente, pois ali o corte foi 0,513, e entre os 30 maiores o mesmo valor apenas ponderaria a população, multiplicada por 1,48 no cálculo. Com o índice inalterado, a redução dos tetos e a redistribuição das unidades elevaram de 224 para 258 os municípios contemplados, e um critério apenas populacional alcançaria 147 (seção 4). A regra de conversão exige, por isso, a mesma documentação que o índice.</w:t>
+        <w:t xml:space="preserve"> Com PCM igual à média estadual, 0,48 (Tabela 5), um município de 5 a 20 mil habitantes seria contemplado no bloco 3, cuja linha de corte nessa faixa ficou em 0,469. Um de até 5 mil seria suplente, pois ali o corte foi 0,513; entre os 30 maiores, o mesmo valor apenas ponderaria a população, multiplicada por 1,48 no cálculo. Com o índice inalterado, a redução dos tetos e a redistribuição das unidades elevaram de 224 para 258 os municípios contemplados, e o contrafactual apenas populacional da seção 4.2 alcançaria 147. A regra de conversão exige, por isso, a mesma documentação que o índice.</w:t>
       </w:r>
     </w:p>
     <w:p>

</xml_diff>

<commit_message>
Revisão do parecer: nota técnica do contrafactual, pesos pela focalização e lições reescritas
- Nota técnica de duas páginas no material suplementar com a construção,
  a comparabilidade, os resultados e os limites da análise contrafactual
  (ponto 1); a seção 4.2 resume os resultados e a nota 8 remete a ela.
- Seção 3.4: pilares ligados ao objeto do programa com peso 2 e
  demográfico, transversal, com peso 1; atos citados como orientação, sem
  fixar valores.
- Seção 5: lições na ordem tese, resultado e inferência; cortes do
  bloco 3 também na seção 4.1.
- Carta atualizada nos pontos 1, 2 e 4.

Co-Authored-By: Claude Opus 5.5 <noreply@anthropic.com>
Claude-Session: https://claude.ai/code/session_01MDzyNreLrve5brDgfNKZ3e
</commit_message>
<xml_diff>
--- a/creches-parana/10_revisao_parecer/Artigo_Creches_revisado_parecer.docx
+++ b/creches-parana/10_revisao_parecer/Artigo_Creches_revisado_parecer.docx
@@ -7819,7 +7819,7 @@
         <w:rPr>
           <w:lang w:val="pt-BR"/>
         </w:rPr>
-        <w:t xml:space="preserve">Os pesos da Figura 3 traduzem um critério de focalização social. A Deliberação nº 60/2023 do CEDCA/PR incumbiu a SEDEF de definir e ordenar por prioridade as localidades de maior vulnerabilidade, risco social e elevada demanda para a educação infantil (CEDCA, 2023, art. 2º). A lei do programa destina as creches às crianças em situação de vulnerabilidade (PARANÁ, 2023), e o Plano Nacional de Educação fixou como estratégia reduzir a menos de 10% a diferença de frequência à creche entre o quinto de renda mais alto e o mais baixo (BRASIL, 2014, estratégia 1.2). A demanda priorizada aparece sobretudo na lacuna de vagas, que o fator educacional mede, e o retorno do acesso à creche é maior entre as famílias pobres (seção 2.2). Por isso, os fatores educacional e socioeconômico recebem peso 2, e o demográfico, que capta a pressão potencial da demanda por indicadores indiretos, peso 1. A equipe técnica da Casa Civil converteu a orientação nesses valores, aplicados no ranqueamento que o CEDCA/PR aprovou com o estudo; a Deliberação nº 25/2024 registra que o estudo considerou os dados de vulnerabilidade, risco social e demanda (CEDCA, 2024). Na classificação de Decancq e Lugo (2013), a ponderação é normativa, sem estimação estatística, e o manual da OCDE admite pesos que reflitam prioridades de política (OECD; JRC, 2008, p. 31).</w:t>
+        <w:t xml:space="preserve">Os pesos da Figura 3 seguem a focalização do programa. Como ele constrói creches para crianças em situação de vulnerabilidade (PARANÁ, 2023), os pilares ligados diretamente a esse objeto recebem peso 2: o educacional mede a lacuna de vagas que a obra preenche, e o socioeconômico, a vulnerabilidade das famílias, entre as quais o retorno do acesso à creche é maior (seção 2.2). O demográfico tem perspectiva transversal, pois a pressão da demanda que ele mede se relaciona com as outras duas dimensões sem medir diretamente a lacuna nem a vulnerabilidade; com peso 1, permanece no índice sem desequilibrá-lo nem diluir a focalização. A orientação é coerente com a Deliberação nº 60/2023 do CEDCA/PR, que incumbiu a SEDEF de definir e priorizar as localidades de maior vulnerabilidade, risco social e elevada demanda para a educação infantil (CEDCA, 2023, art. 2º), e com a estratégia 1.2 do Plano Nacional de Educação, que fixou a redução da desigualdade de frequência à creche entre os quintos de renda (BRASIL, 2014). Esses atos não fixam valores; os pesos foram definidos pela equipe técnica da Casa Civil, autora do estudo (PARANÁ, 2024a), e aplicados no ranqueamento que o CEDCA/PR aprovou (CEDCA, 2024). Na classificação de Decancq e Lugo (2013), a ponderação é normativa, sem estimação estatística, e o manual da OCDE admite pesos que reflitam prioridades de política (OECD; JRC, 2008, p. 31).</w:t>
       </w:r>
     </w:p>
     <w:p>
@@ -7846,7 +7846,7 @@
         <w:rPr>
           <w:lang w:val="pt-BR"/>
         </w:rPr>
-        <w:t xml:space="preserve">, reforçam a escolha. Com correlações de postos de 0,02 a 0,23 entre os fatores, é improvável uma dimensão latente comum, e pesos de análise fatorial ou de componentes principais seriam pouco informativos (OECD; JRC, 2008, p. 32, 89). A qualidade dos dados, critério que o manual admite com ressalvas (OECD; JRC, 2008, p. 32), corrobora o peso menor do fator demográfico, cuja variação vem sobretudo da mortalidade infantil, instável nos municípios pequenos. Em 2020, 133 dos 399 municípios não registraram óbito infantil, e, nos de até 5 mil habitantes, com mediana de 42 nascimentos por ano, um único óbito altera a taxa em cerca de 24 por mil. A equação (5) consolida o cálculo, e o Mapa 4 mostra o resultado:</w:t>
+        <w:t xml:space="preserve">, corroboram a escolha. Com correlações de postos de 0,02 a 0,23 entre os fatores, é improvável uma dimensão latente comum, e pesos de análise fatorial seriam pouco informativos (OECD; JRC, 2008, p. 32, 89). A qualidade dos dados, que o manual admite com ressalvas (OECD; JRC, 2008, p. 32), também desaconselha peso maior ao fator demográfico, cuja variação vem sobretudo da mortalidade infantil. Em 2020, 133 dos 399 municípios não registraram óbito infantil, e, nos de até 5 mil habitantes, um único óbito altera a taxa em cerca de 24 por mil. A equação (5) consolida o cálculo, e o Mapa 4 mostra o resultado:</w:t>
       </w:r>
     </w:p>
     <w:p>
@@ -10012,7 +10012,7 @@
         <w:rPr>
           <w:lang w:val="pt-BR"/>
         </w:rPr>
-        <w:t xml:space="preserve"> do último contemplado é a linha de corte da faixa; abaixo dela, os demais permanecem na ordem do índice, como suplentes.</w:t>
+        <w:t xml:space="preserve"> do último contemplado é a linha de corte da faixa (0,469 de 5 a 20 mil e 0,513 até 5 mil); os demais ficam como suplentes, na ordem do índice.</w:t>
       </w:r>
     </w:p>
     <w:p>
@@ -15456,7 +15456,7 @@
         <w:rPr>
           <w:lang w:val="pt-BR"/>
         </w:rPr>
-        <w:t xml:space="preserve">Para medir o efeito da distribuição adotada sobre a seleção territorial, comparamos a versão de maio de 2024, aprovada pelo CEDCA/PR, com um critério apenas populacional, que repartiria as mesmas 300 unidades em proporção à população de zero a quatro anos</w:t>
+        <w:t xml:space="preserve">Para medir o efeito do índice e da regra sobre a seleção territorial, comparamos a versão aprovada em maio de 2024 com um contrafactual que repartiria as mesmas 300 unidades apenas pela população de zero a quatro anos</w:t>
       </w:r>
       <w:r>
         <w:rPr>
@@ -15469,7 +15469,7 @@
         <w:rPr>
           <w:lang w:val="pt-BR"/>
         </w:rPr>
-        <w:t xml:space="preserve">. A versão aprovada contemplou 258 municípios, contra 147, deu 6 unidades a Curitiba, contra 37, e destinou 28% das unidades aos 80 municípios de maior PCM, contra 13%; 89% das crianças de zero a quatro anos viviam em municípios contemplados, contra 85%. Na versão de março, anterior à redistribuição, eram 224 municípios contemplados, com 82% das crianças.</w:t>
+        <w:t xml:space="preserve">. A versão aprovada contemplou 258 municípios, contra 147, e destinou 28% das unidades aos 80 municípios de maior PCM, contra 13%; 89% das crianças de zero a quatro anos viviam em municípios contemplados, contra 85%.</w:t>
       </w:r>
     </w:p>
     <w:p>
@@ -15526,7 +15526,7 @@
         <w:rPr>
           <w:lang w:val="pt-BR"/>
         </w:rPr>
-        <w:t xml:space="preserve"> Com PCM igual à média estadual, 0,48 (Tabela 5), um município de 5 a 20 mil habitantes seria contemplado no bloco 3, cuja linha de corte nessa faixa ficou em 0,469. Um de até 5 mil seria suplente, pois ali o corte foi 0,513; entre os 30 maiores, o mesmo valor apenas ponderaria a população, multiplicada por 1,48 no cálculo. Com o índice inalterado, a redução dos tetos e a redistribuição das unidades elevaram de 224 para 258 os municípios contemplados, e o contrafactual apenas populacional da seção 4.2 alcançaria 147. A regra de conversão exige, por isso, a mesma documentação que o índice.</w:t>
+        <w:t xml:space="preserve"> Três comparações com as mesmas 300 unidades sustentam essa lição. A versão aprovada contemplou 258 municípios, contra 147 no contrafactual populacional, sem índice, faixas ou tetos (seção 4.2). Entre março e maio de 2024, com o mesmo índice, a redução dos tetos e a redistribuição de 38 unidades elevaram os contemplados de 224 para 258 (seção 4.1). No bloco 3 (seção 4.1), o mesmo PCM leva a resultados opostos conforme a faixa. Com a média estadual, 0,48 (Tabela 5), um município seria contemplado na faixa de 5 a 20 mil habitantes (corte em 0,469) e suplente na de até 5 mil (corte em 0,513). O resultado territorial depende, portanto, também da regra de conversão, que exige a mesma documentação que o índice.</w:t>
       </w:r>
     </w:p>
     <w:p>
@@ -15552,7 +15552,7 @@
         <w:rPr>
           <w:lang w:val="pt-BR"/>
         </w:rPr>
-        <w:t xml:space="preserve"> Os fatores reúnem registros da educação, da saúde, da assistência social e da economia regional e têm correlações de postos de 0,02 a 0,23 entre si (seção 3.4), de modo que cada um acrescenta informação própria. Como o fator educacional cresce com o porte e o socioeconômico diminui, o PCM médio fica entre 0,415 e 0,498 em todas as faixas, exceto em Curitiba (Tabela 5); um índice só educacional favoreceria as cidades maiores, e um só socioeconômico, as menores. A decisão também envolveu vários órgãos, do estudo da Casa Civil e do Ipardes à adesão dos municípios (Figura 1).</w:t>
+        <w:t xml:space="preserve"> Os fatores reúnem registros da educação, da saúde, da assistência social e da economia regional e têm correlações de postos de 0,02 a 0,23 entre si (seção 3.4); cada setor acrescenta, assim, informação própria. Como o fator educacional cresce com o porte e o socioeconômico diminui, o PCM médio fica entre 0,415 e 0,498 em todas as faixas, exceto em Curitiba (Tabela 5); um índice só educacional favoreceria as cidades maiores, e um só socioeconômico, as menores. Sem o índice, essa informação se perde: no contrafactual populacional, os 80 municípios de maior PCM receberiam 13% das unidades, contra 28% na versão aprovada (seção 4.2).</w:t>
       </w:r>
     </w:p>
     <w:p>
@@ -15578,7 +15578,7 @@
         <w:rPr>
           <w:lang w:val="pt-BR"/>
         </w:rPr>
-        <w:t xml:space="preserve"> Confrontada com o estudo aprovado pelo CEDCA/PR e com as planilhas, a lista publicada (PARANÁ, 2024a) mostra onde a decisão seguiu o índice e onde se afastou dele. Nas faixas de até 20 mil habitantes, o bloco 3 segue a ordem do PCM, com menos de um centésimo entre o último contemplado e o primeiro suplente, dentro da margem em que pesos alternativos trocam municípios (seção 3.4). Os municípios que entraram em maio, ao contrário, passaram à frente de suplentes com PCM maior (seção 4.2). Terreno e capacidade de licitar, que o índice não capta, entram pela adesão (PARANÁ, 2024c), e a vaga de quem desiste passa ao próximo ranqueado (PARANÁ, 2024a).</w:t>
+        <w:t xml:space="preserve"> Nas faixas de até 20 mil habitantes, o bloco 3 segue a ordem do PCM. Menos de um centésimo separa o último contemplado do primeiro suplente, distância em que pesos alternativos já trocam municípios (seção 3.4). Os 35 municípios que entraram em maio, ao contrário, passaram à frente de suplentes com PCM maior (seção 4.2). Confrontar a lista publicada (PARANÁ, 2024a) com o estudo e as planilhas permite, assim, separar o que decorre do índice do que decorre de ajustes posteriores.</w:t>
       </w:r>
     </w:p>
     <w:p>
@@ -16795,7 +16795,7 @@
         <w:rPr>
           <w:lang w:val="pt-BR"/>
         </w:rPr>
-        <w:t xml:space="preserve"> O critério populacional é uma simulação contrafactual da distribuição que se observaria na ausência da regra adotada: reparte as 300 unidades entre os 399 municípios em proporção à população de zero a quatro anos do Censo Demográfico de 2022 (IBGE, 2023), pelo maior resto usado no bloco 2 (BALINSKI; YOUNG, 2001), sem PCM, faixas, cotas, tetos ou etapa prévia. A versão de maio soma as mesmas 300 unidades e inclui as 43 da etapa prévia, anteriores ao índice; mantidas essas 43 e repartidas as outras 257 pela população, seriam 152 municípios, 31 unidades em Curitiba e 17% das unidades nos 80 municípios de maior PCM. A simulação é estática e não considera adesões, desistências nem capacidade de execução.</w:t>
+        <w:t xml:space="preserve"> Simulação contrafactual da distribuição que se observaria na ausência da regra adotada, com o mesmo total de unidades e os mesmos 399 municípios. A nota técnica do material suplementar detalha sua construção, a comparabilidade com as versões de março e maio de 2024 e os limites da inferência.</w:t>
       </w:r>
     </w:p>
   </w:footnote>

</xml_diff>